<commit_message>
feat(diagnosis): NCPMS 공식 이미지 상세보기 Dialog 추가
- 사진 판독 결과에서 '상세보기' 버튼으로 전체 NCPMS 공식 이미지 열람 가능
- getAllNpmsImages() 유틸 함수 추가 (4장 제한 없이 전체 이미지 반환)
- Dialog 헤더에 병명/작물명/카테고리 표시
- 처음 진단 결과와 저장된 기록 모두에 동일하게 적용
- NpmsImageGallery 빈 상태 처리 및 반응형 그리드 개선
- .gitignore 정리 (깨진 바이트 수정, tmp/ 및 Word 임시파일 제외)
- 진단 파이프라인 정확도 개선 (촬영 부위 필터링 강화)
</commit_message>
<xml_diff>
--- a/01_경진대회_개인정보수집동의서+및+참가+서약서.docx
+++ b/01_경진대회_개인정보수집동의서+및+참가+서약서.docx
@@ -447,7 +447,25 @@
                 <w:sz w:val="24"/>
                 <w:szCs w:val="24"/>
               </w:rPr>
-              <w:t xml:space="preserve">    서약서 및 신청서 내용이 사실임을 확인하며, 허위사실 기재 등으로 인하여 어떠한 문제가 발생 했을 시 모든 책임은 본인에게 있음을 확인합니다.</w:t>
+              <w:t xml:space="preserve">    서약서 및 신청서 내용이 사실임을 확인하며, 허위사실 기재 등으로 인하여 어떠한 문제가 </w:t>
+            </w:r>
+            <w:proofErr w:type="gramStart"/>
+            <w:r>
+              <w:rPr>
+                <w:rFonts w:ascii="굴림" w:eastAsia="굴림" w:cs="굴림"/>
+                <w:sz w:val="24"/>
+                <w:szCs w:val="24"/>
+              </w:rPr>
+              <w:t>발생 했을</w:t>
+            </w:r>
+            <w:proofErr w:type="gramEnd"/>
+            <w:r>
+              <w:rPr>
+                <w:rFonts w:ascii="굴림" w:eastAsia="굴림" w:cs="굴림"/>
+                <w:sz w:val="24"/>
+                <w:szCs w:val="24"/>
+              </w:rPr>
+              <w:t xml:space="preserve"> 시 모든 책임은 본인에게 있음을 확인합니다.</w:t>
             </w:r>
           </w:p>
           <w:p>
@@ -494,6 +512,7 @@
               </w:rPr>
               <w:t xml:space="preserve">                                  2026년    </w:t>
             </w:r>
+            <w:proofErr w:type="gramStart"/>
             <w:r>
               <w:rPr>
                 <w:rFonts w:ascii="굴림" w:eastAsia="굴림" w:cs="굴림" w:hint="eastAsia"/>
@@ -508,23 +527,50 @@
                 <w:sz w:val="24"/>
                 <w:szCs w:val="24"/>
               </w:rPr>
-              <w:t xml:space="preserve">  월    </w:t>
-            </w:r>
+              <w:t xml:space="preserve">  월</w:t>
+            </w:r>
+            <w:proofErr w:type="gramEnd"/>
+            <w:r>
+              <w:rPr>
+                <w:rFonts w:ascii="굴림" w:eastAsia="굴림" w:cs="굴림"/>
+                <w:sz w:val="24"/>
+                <w:szCs w:val="24"/>
+              </w:rPr>
+              <w:t xml:space="preserve">    </w:t>
+            </w:r>
+            <w:proofErr w:type="gramStart"/>
             <w:r>
               <w:rPr>
                 <w:rFonts w:ascii="굴림" w:eastAsia="굴림" w:cs="굴림" w:hint="eastAsia"/>
                 <w:sz w:val="24"/>
                 <w:szCs w:val="24"/>
               </w:rPr>
-              <w:t>10</w:t>
-            </w:r>
-            <w:r>
-              <w:rPr>
-                <w:rFonts w:ascii="굴림" w:eastAsia="굴림" w:cs="굴림"/>
-                <w:sz w:val="24"/>
-                <w:szCs w:val="24"/>
-              </w:rPr>
-              <w:t xml:space="preserve">  일  </w:t>
+              <w:t>1</w:t>
+            </w:r>
+            <w:r>
+              <w:rPr>
+                <w:rFonts w:ascii="굴림" w:eastAsia="굴림" w:cs="굴림" w:hint="eastAsia"/>
+                <w:sz w:val="24"/>
+                <w:szCs w:val="24"/>
+              </w:rPr>
+              <w:t>1</w:t>
+            </w:r>
+            <w:r>
+              <w:rPr>
+                <w:rFonts w:ascii="굴림" w:eastAsia="굴림" w:cs="굴림"/>
+                <w:sz w:val="24"/>
+                <w:szCs w:val="24"/>
+              </w:rPr>
+              <w:t xml:space="preserve">  일</w:t>
+            </w:r>
+            <w:proofErr w:type="gramEnd"/>
+            <w:r>
+              <w:rPr>
+                <w:rFonts w:ascii="굴림" w:eastAsia="굴림" w:cs="굴림"/>
+                <w:sz w:val="24"/>
+                <w:szCs w:val="24"/>
+              </w:rPr>
+              <w:t xml:space="preserve">  </w:t>
             </w:r>
           </w:p>
           <w:p>
@@ -865,7 +911,7 @@
         <w:pStyle w:val="a8"/>
         <w:spacing w:line="240" w:lineRule="auto"/>
         <w:rPr>
-          <w:rFonts w:ascii="맑은 고딕" w:eastAsia="맑은 고딕" w:cs="맑은 고딕" w:hint="eastAsia"/>
+          <w:rFonts w:ascii="맑은 고딕" w:eastAsia="맑은 고딕" w:cs="맑은 고딕"/>
           <w:b/>
           <w:bCs/>
         </w:rPr>
@@ -999,7 +1045,7 @@
         <w:pStyle w:val="a8"/>
         <w:spacing w:line="240" w:lineRule="auto"/>
         <w:rPr>
-          <w:rFonts w:ascii="맑은 고딕" w:eastAsia="맑은 고딕" w:cs="맑은 고딕" w:hint="eastAsia"/>
+          <w:rFonts w:ascii="맑은 고딕" w:eastAsia="맑은 고딕" w:cs="맑은 고딕"/>
           <w:b/>
           <w:bCs/>
         </w:rPr>
@@ -2158,6 +2204,7 @@
                 <w:sz w:val="24"/>
                 <w:szCs w:val="24"/>
               </w:rPr>
+              <w:lastRenderedPageBreak/>
               <w:t xml:space="preserve">    </w:t>
             </w:r>
             <w:r>
@@ -2194,8 +2241,25 @@
                 <w:sz w:val="24"/>
                 <w:szCs w:val="24"/>
               </w:rPr>
-              <w:lastRenderedPageBreak/>
-              <w:t xml:space="preserve">      - 보존 이유 : 참가자 관리 및 후속지원</w:t>
+              <w:t xml:space="preserve">      - 보존 </w:t>
+            </w:r>
+            <w:proofErr w:type="gramStart"/>
+            <w:r>
+              <w:rPr>
+                <w:rFonts w:ascii="굴림" w:eastAsia="굴림" w:cs="굴림"/>
+                <w:sz w:val="24"/>
+                <w:szCs w:val="24"/>
+              </w:rPr>
+              <w:t>이유 :</w:t>
+            </w:r>
+            <w:proofErr w:type="gramEnd"/>
+            <w:r>
+              <w:rPr>
+                <w:rFonts w:ascii="굴림" w:eastAsia="굴림" w:cs="굴림"/>
+                <w:sz w:val="24"/>
+                <w:szCs w:val="24"/>
+              </w:rPr>
+              <w:t xml:space="preserve"> 참가자 관리 및 후속지원</w:t>
             </w:r>
           </w:p>
           <w:p>
@@ -2229,7 +2293,31 @@
                 <w:szCs w:val="24"/>
                 <w:u w:val="single" w:color="000000"/>
               </w:rPr>
-              <w:t>보존 기간 : 당해 연도 경진대회 결선 결과발표 후 3년 간</w:t>
+              <w:t xml:space="preserve">보존 </w:t>
+            </w:r>
+            <w:proofErr w:type="gramStart"/>
+            <w:r>
+              <w:rPr>
+                <w:rFonts w:ascii="굴림" w:eastAsia="굴림" w:cs="굴림"/>
+                <w:b/>
+                <w:bCs/>
+                <w:sz w:val="24"/>
+                <w:szCs w:val="24"/>
+                <w:u w:val="single" w:color="000000"/>
+              </w:rPr>
+              <w:t>기간 :</w:t>
+            </w:r>
+            <w:proofErr w:type="gramEnd"/>
+            <w:r>
+              <w:rPr>
+                <w:rFonts w:ascii="굴림" w:eastAsia="굴림" w:cs="굴림"/>
+                <w:b/>
+                <w:bCs/>
+                <w:sz w:val="24"/>
+                <w:szCs w:val="24"/>
+                <w:u w:val="single" w:color="000000"/>
+              </w:rPr>
+              <w:t xml:space="preserve"> 당해 연도 경진대회 결선 결과발표 후 3년 간</w:t>
             </w:r>
           </w:p>
           <w:p>
@@ -2739,6 +2827,7 @@
         </w:rPr>
         <w:t xml:space="preserve">2026.  </w:t>
       </w:r>
+      <w:proofErr w:type="gramStart"/>
       <w:r>
         <w:rPr>
           <w:rFonts w:ascii="HCI Poppy" w:eastAsiaTheme="minorEastAsia" w:cs="HCI Poppy" w:hint="eastAsia"/>
@@ -2753,15 +2842,33 @@
           <w:sz w:val="28"/>
           <w:szCs w:val="28"/>
         </w:rPr>
-        <w:t xml:space="preserve">  .   </w:t>
+        <w:t xml:space="preserve">  .</w:t>
       </w:r>
+      <w:proofErr w:type="gramEnd"/>
+      <w:r>
+        <w:rPr>
+          <w:rFonts w:ascii="HCI Poppy" w:eastAsia="HCI Poppy" w:cs="HCI Poppy"/>
+          <w:sz w:val="28"/>
+          <w:szCs w:val="28"/>
+        </w:rPr>
+        <w:t xml:space="preserve">   </w:t>
+      </w:r>
+      <w:proofErr w:type="gramStart"/>
       <w:r>
         <w:rPr>
           <w:rFonts w:ascii="HCI Poppy" w:eastAsiaTheme="minorEastAsia" w:cs="HCI Poppy" w:hint="eastAsia"/>
           <w:sz w:val="28"/>
           <w:szCs w:val="28"/>
         </w:rPr>
-        <w:t>10</w:t>
+        <w:t>1</w:t>
+      </w:r>
+      <w:r>
+        <w:rPr>
+          <w:rFonts w:ascii="HCI Poppy" w:eastAsiaTheme="minorEastAsia" w:cs="HCI Poppy" w:hint="eastAsia"/>
+          <w:sz w:val="28"/>
+          <w:szCs w:val="28"/>
+        </w:rPr>
+        <w:t>1</w:t>
       </w:r>
       <w:r>
         <w:rPr>
@@ -2771,6 +2878,7 @@
         </w:rPr>
         <w:t xml:space="preserve">  .</w:t>
       </w:r>
+      <w:proofErr w:type="gramEnd"/>
     </w:p>
     <w:tbl>
       <w:tblPr>
@@ -2868,6 +2976,7 @@
                 <w:szCs w:val="24"/>
               </w:rPr>
             </w:pPr>
+            <w:proofErr w:type="gramStart"/>
             <w:r>
               <w:rPr>
                 <w:rFonts w:ascii="굴림" w:eastAsia="굴림" w:cs="굴림"/>
@@ -2878,6 +2987,7 @@
               </w:rPr>
               <w:t>소  속</w:t>
             </w:r>
+            <w:proofErr w:type="gramEnd"/>
           </w:p>
         </w:tc>
         <w:tc>
@@ -2946,6 +3056,7 @@
                 <w:szCs w:val="24"/>
               </w:rPr>
             </w:pPr>
+            <w:proofErr w:type="gramStart"/>
             <w:r>
               <w:rPr>
                 <w:rFonts w:ascii="굴림" w:eastAsia="굴림" w:cs="굴림"/>
@@ -2954,7 +3065,18 @@
                 <w:sz w:val="24"/>
                 <w:szCs w:val="24"/>
               </w:rPr>
-              <w:t xml:space="preserve">서  명 </w:t>
+              <w:t>서  명</w:t>
+            </w:r>
+            <w:proofErr w:type="gramEnd"/>
+            <w:r>
+              <w:rPr>
+                <w:rFonts w:ascii="굴림" w:eastAsia="굴림" w:cs="굴림"/>
+                <w:b/>
+                <w:bCs/>
+                <w:sz w:val="24"/>
+                <w:szCs w:val="24"/>
+              </w:rPr>
+              <w:t xml:space="preserve"> </w:t>
             </w:r>
           </w:p>
         </w:tc>
@@ -3226,33 +3348,6 @@
                 <w:szCs w:val="22"/>
               </w:rPr>
             </w:pPr>
-            <w:r>
-              <w:rPr>
-                <w:rFonts w:ascii="HCI Poppy" w:eastAsia="HY신명조" w:cs="HY신명조"/>
-                <w:spacing w:val="-1"/>
-                <w:sz w:val="22"/>
-                <w:szCs w:val="22"/>
-              </w:rPr>
-              <w:t>□</w:t>
-            </w:r>
-            <w:r>
-              <w:rPr>
-                <w:rFonts w:ascii="HCI Poppy" w:eastAsia="HY신명조" w:cs="HY신명조"/>
-                <w:spacing w:val="-1"/>
-                <w:sz w:val="22"/>
-                <w:szCs w:val="22"/>
-              </w:rPr>
-              <w:t xml:space="preserve"> </w:t>
-            </w:r>
-            <w:r>
-              <w:rPr>
-                <w:rFonts w:ascii="HCI Poppy" w:eastAsia="휴먼명조" w:cs="휴먼명조"/>
-                <w:spacing w:val="-1"/>
-                <w:sz w:val="22"/>
-                <w:szCs w:val="22"/>
-              </w:rPr>
-              <w:t>동의</w:t>
-            </w:r>
           </w:p>
         </w:tc>
         <w:tc>
@@ -3280,33 +3375,6 @@
                 <w:szCs w:val="22"/>
               </w:rPr>
             </w:pPr>
-            <w:r>
-              <w:rPr>
-                <w:rFonts w:ascii="HCI Poppy" w:eastAsia="HY신명조" w:cs="HY신명조"/>
-                <w:spacing w:val="-1"/>
-                <w:sz w:val="22"/>
-                <w:szCs w:val="22"/>
-              </w:rPr>
-              <w:t>□</w:t>
-            </w:r>
-            <w:r>
-              <w:rPr>
-                <w:rFonts w:ascii="HCI Poppy" w:eastAsia="HY신명조" w:cs="HY신명조"/>
-                <w:spacing w:val="-1"/>
-                <w:sz w:val="22"/>
-                <w:szCs w:val="22"/>
-              </w:rPr>
-              <w:t xml:space="preserve"> </w:t>
-            </w:r>
-            <w:r>
-              <w:rPr>
-                <w:rFonts w:ascii="HCI Poppy" w:eastAsia="휴먼명조" w:cs="휴먼명조"/>
-                <w:spacing w:val="-1"/>
-                <w:sz w:val="22"/>
-                <w:szCs w:val="22"/>
-              </w:rPr>
-              <w:t>미동의</w:t>
-            </w:r>
           </w:p>
         </w:tc>
         <w:tc>
@@ -3402,33 +3470,6 @@
                 <w:szCs w:val="22"/>
               </w:rPr>
             </w:pPr>
-            <w:r>
-              <w:rPr>
-                <w:rFonts w:ascii="HCI Poppy" w:eastAsia="HY신명조" w:cs="HY신명조"/>
-                <w:spacing w:val="-1"/>
-                <w:sz w:val="22"/>
-                <w:szCs w:val="22"/>
-              </w:rPr>
-              <w:t>□</w:t>
-            </w:r>
-            <w:r>
-              <w:rPr>
-                <w:rFonts w:ascii="HCI Poppy" w:eastAsia="HY신명조" w:cs="HY신명조"/>
-                <w:spacing w:val="-1"/>
-                <w:sz w:val="22"/>
-                <w:szCs w:val="22"/>
-              </w:rPr>
-              <w:t xml:space="preserve"> </w:t>
-            </w:r>
-            <w:r>
-              <w:rPr>
-                <w:rFonts w:ascii="HCI Poppy" w:eastAsia="휴먼명조" w:cs="휴먼명조"/>
-                <w:spacing w:val="-1"/>
-                <w:sz w:val="22"/>
-                <w:szCs w:val="22"/>
-              </w:rPr>
-              <w:t>동의</w:t>
-            </w:r>
           </w:p>
         </w:tc>
         <w:tc>
@@ -3456,33 +3497,6 @@
                 <w:szCs w:val="22"/>
               </w:rPr>
             </w:pPr>
-            <w:r>
-              <w:rPr>
-                <w:rFonts w:ascii="HCI Poppy" w:eastAsia="HY신명조" w:cs="HY신명조"/>
-                <w:spacing w:val="-1"/>
-                <w:sz w:val="22"/>
-                <w:szCs w:val="22"/>
-              </w:rPr>
-              <w:t>□</w:t>
-            </w:r>
-            <w:r>
-              <w:rPr>
-                <w:rFonts w:ascii="HCI Poppy" w:eastAsia="HY신명조" w:cs="HY신명조"/>
-                <w:spacing w:val="-1"/>
-                <w:sz w:val="22"/>
-                <w:szCs w:val="22"/>
-              </w:rPr>
-              <w:t xml:space="preserve"> </w:t>
-            </w:r>
-            <w:r>
-              <w:rPr>
-                <w:rFonts w:ascii="HCI Poppy" w:eastAsia="휴먼명조" w:cs="휴먼명조"/>
-                <w:spacing w:val="-1"/>
-                <w:sz w:val="22"/>
-                <w:szCs w:val="22"/>
-              </w:rPr>
-              <w:t>미동의</w:t>
-            </w:r>
           </w:p>
         </w:tc>
         <w:tc>
@@ -3578,33 +3592,6 @@
                 <w:szCs w:val="22"/>
               </w:rPr>
             </w:pPr>
-            <w:r>
-              <w:rPr>
-                <w:rFonts w:ascii="HCI Poppy" w:eastAsia="HY신명조" w:cs="HY신명조"/>
-                <w:spacing w:val="-1"/>
-                <w:sz w:val="22"/>
-                <w:szCs w:val="22"/>
-              </w:rPr>
-              <w:t>□</w:t>
-            </w:r>
-            <w:r>
-              <w:rPr>
-                <w:rFonts w:ascii="HCI Poppy" w:eastAsia="HY신명조" w:cs="HY신명조"/>
-                <w:spacing w:val="-1"/>
-                <w:sz w:val="22"/>
-                <w:szCs w:val="22"/>
-              </w:rPr>
-              <w:t xml:space="preserve"> </w:t>
-            </w:r>
-            <w:r>
-              <w:rPr>
-                <w:rFonts w:ascii="HCI Poppy" w:eastAsia="휴먼명조" w:cs="휴먼명조"/>
-                <w:spacing w:val="-1"/>
-                <w:sz w:val="22"/>
-                <w:szCs w:val="22"/>
-              </w:rPr>
-              <w:t>동의</w:t>
-            </w:r>
           </w:p>
         </w:tc>
         <w:tc>
@@ -3632,33 +3619,6 @@
                 <w:szCs w:val="22"/>
               </w:rPr>
             </w:pPr>
-            <w:r>
-              <w:rPr>
-                <w:rFonts w:ascii="HCI Poppy" w:eastAsia="HY신명조" w:cs="HY신명조"/>
-                <w:spacing w:val="-1"/>
-                <w:sz w:val="22"/>
-                <w:szCs w:val="22"/>
-              </w:rPr>
-              <w:t>□</w:t>
-            </w:r>
-            <w:r>
-              <w:rPr>
-                <w:rFonts w:ascii="HCI Poppy" w:eastAsia="HY신명조" w:cs="HY신명조"/>
-                <w:spacing w:val="-1"/>
-                <w:sz w:val="22"/>
-                <w:szCs w:val="22"/>
-              </w:rPr>
-              <w:t xml:space="preserve"> </w:t>
-            </w:r>
-            <w:r>
-              <w:rPr>
-                <w:rFonts w:ascii="HCI Poppy" w:eastAsia="휴먼명조" w:cs="휴먼명조"/>
-                <w:spacing w:val="-1"/>
-                <w:sz w:val="22"/>
-                <w:szCs w:val="22"/>
-              </w:rPr>
-              <w:t>미동의</w:t>
-            </w:r>
           </w:p>
         </w:tc>
         <w:tc>
@@ -3754,33 +3714,6 @@
                 <w:szCs w:val="22"/>
               </w:rPr>
             </w:pPr>
-            <w:r>
-              <w:rPr>
-                <w:rFonts w:ascii="HCI Poppy" w:eastAsia="HY신명조" w:cs="HY신명조"/>
-                <w:spacing w:val="-1"/>
-                <w:sz w:val="22"/>
-                <w:szCs w:val="22"/>
-              </w:rPr>
-              <w:t>□</w:t>
-            </w:r>
-            <w:r>
-              <w:rPr>
-                <w:rFonts w:ascii="HCI Poppy" w:eastAsia="HY신명조" w:cs="HY신명조"/>
-                <w:spacing w:val="-1"/>
-                <w:sz w:val="22"/>
-                <w:szCs w:val="22"/>
-              </w:rPr>
-              <w:t xml:space="preserve"> </w:t>
-            </w:r>
-            <w:r>
-              <w:rPr>
-                <w:rFonts w:ascii="HCI Poppy" w:eastAsia="휴먼명조" w:cs="휴먼명조"/>
-                <w:spacing w:val="-1"/>
-                <w:sz w:val="22"/>
-                <w:szCs w:val="22"/>
-              </w:rPr>
-              <w:t>동의</w:t>
-            </w:r>
           </w:p>
         </w:tc>
         <w:tc>
@@ -3808,33 +3741,6 @@
                 <w:szCs w:val="22"/>
               </w:rPr>
             </w:pPr>
-            <w:r>
-              <w:rPr>
-                <w:rFonts w:ascii="HCI Poppy" w:eastAsia="HY신명조" w:cs="HY신명조"/>
-                <w:spacing w:val="-1"/>
-                <w:sz w:val="22"/>
-                <w:szCs w:val="22"/>
-              </w:rPr>
-              <w:t>□</w:t>
-            </w:r>
-            <w:r>
-              <w:rPr>
-                <w:rFonts w:ascii="HCI Poppy" w:eastAsia="HY신명조" w:cs="HY신명조"/>
-                <w:spacing w:val="-1"/>
-                <w:sz w:val="22"/>
-                <w:szCs w:val="22"/>
-              </w:rPr>
-              <w:t xml:space="preserve"> </w:t>
-            </w:r>
-            <w:r>
-              <w:rPr>
-                <w:rFonts w:ascii="HCI Poppy" w:eastAsia="휴먼명조" w:cs="휴먼명조"/>
-                <w:spacing w:val="-1"/>
-                <w:sz w:val="22"/>
-                <w:szCs w:val="22"/>
-              </w:rPr>
-              <w:t>미동의</w:t>
-            </w:r>
           </w:p>
         </w:tc>
         <w:tc>
@@ -5091,6 +4997,7 @@
         </w:rPr>
         <w:t xml:space="preserve">2026.   </w:t>
       </w:r>
+      <w:proofErr w:type="gramStart"/>
       <w:r>
         <w:rPr>
           <w:rFonts w:ascii="HCI Poppy" w:eastAsiaTheme="minorEastAsia" w:cs="HCI Poppy" w:hint="eastAsia"/>
@@ -5105,15 +5012,33 @@
           <w:sz w:val="28"/>
           <w:szCs w:val="28"/>
         </w:rPr>
-        <w:t xml:space="preserve"> .   </w:t>
+        <w:t xml:space="preserve"> .</w:t>
       </w:r>
+      <w:proofErr w:type="gramEnd"/>
+      <w:r>
+        <w:rPr>
+          <w:rFonts w:ascii="HCI Poppy" w:eastAsia="HCI Poppy" w:cs="HCI Poppy"/>
+          <w:sz w:val="28"/>
+          <w:szCs w:val="28"/>
+        </w:rPr>
+        <w:t xml:space="preserve">   </w:t>
+      </w:r>
+      <w:proofErr w:type="gramStart"/>
       <w:r>
         <w:rPr>
           <w:rFonts w:ascii="HCI Poppy" w:eastAsiaTheme="minorEastAsia" w:cs="HCI Poppy" w:hint="eastAsia"/>
           <w:sz w:val="28"/>
           <w:szCs w:val="28"/>
         </w:rPr>
-        <w:t>10</w:t>
+        <w:t>1</w:t>
+      </w:r>
+      <w:r>
+        <w:rPr>
+          <w:rFonts w:ascii="HCI Poppy" w:eastAsiaTheme="minorEastAsia" w:cs="HCI Poppy" w:hint="eastAsia"/>
+          <w:sz w:val="28"/>
+          <w:szCs w:val="28"/>
+        </w:rPr>
+        <w:t>1</w:t>
       </w:r>
       <w:r>
         <w:rPr>
@@ -5123,6 +5048,7 @@
         </w:rPr>
         <w:t xml:space="preserve">  .</w:t>
       </w:r>
+      <w:proofErr w:type="gramEnd"/>
     </w:p>
     <w:tbl>
       <w:tblPr>
@@ -5220,6 +5146,7 @@
                 <w:szCs w:val="24"/>
               </w:rPr>
             </w:pPr>
+            <w:proofErr w:type="gramStart"/>
             <w:r>
               <w:rPr>
                 <w:rFonts w:ascii="굴림" w:eastAsia="굴림" w:cs="굴림"/>
@@ -5230,6 +5157,7 @@
               </w:rPr>
               <w:t>소  속</w:t>
             </w:r>
+            <w:proofErr w:type="gramEnd"/>
           </w:p>
         </w:tc>
         <w:tc>
@@ -5298,6 +5226,7 @@
                 <w:szCs w:val="24"/>
               </w:rPr>
             </w:pPr>
+            <w:proofErr w:type="gramStart"/>
             <w:r>
               <w:rPr>
                 <w:rFonts w:ascii="굴림" w:eastAsia="굴림" w:cs="굴림"/>
@@ -5306,7 +5235,18 @@
                 <w:sz w:val="24"/>
                 <w:szCs w:val="24"/>
               </w:rPr>
-              <w:t xml:space="preserve">서  명 </w:t>
+              <w:t>서  명</w:t>
+            </w:r>
+            <w:proofErr w:type="gramEnd"/>
+            <w:r>
+              <w:rPr>
+                <w:rFonts w:ascii="굴림" w:eastAsia="굴림" w:cs="굴림"/>
+                <w:b/>
+                <w:bCs/>
+                <w:sz w:val="24"/>
+                <w:szCs w:val="24"/>
+              </w:rPr>
+              <w:t xml:space="preserve"> </w:t>
             </w:r>
           </w:p>
         </w:tc>
@@ -5628,33 +5568,6 @@
                 <w:szCs w:val="22"/>
               </w:rPr>
             </w:pPr>
-            <w:r>
-              <w:rPr>
-                <w:rFonts w:ascii="HCI Poppy" w:eastAsia="HY신명조" w:cs="HY신명조"/>
-                <w:spacing w:val="-1"/>
-                <w:sz w:val="22"/>
-                <w:szCs w:val="22"/>
-              </w:rPr>
-              <w:t>□</w:t>
-            </w:r>
-            <w:r>
-              <w:rPr>
-                <w:rFonts w:ascii="HCI Poppy" w:eastAsia="HY신명조" w:cs="HY신명조"/>
-                <w:spacing w:val="-1"/>
-                <w:sz w:val="22"/>
-                <w:szCs w:val="22"/>
-              </w:rPr>
-              <w:t xml:space="preserve"> </w:t>
-            </w:r>
-            <w:r>
-              <w:rPr>
-                <w:rFonts w:ascii="HCI Poppy" w:eastAsia="휴먼명조" w:cs="휴먼명조"/>
-                <w:spacing w:val="-1"/>
-                <w:sz w:val="22"/>
-                <w:szCs w:val="22"/>
-              </w:rPr>
-              <w:t>동의</w:t>
-            </w:r>
           </w:p>
         </w:tc>
         <w:tc>
@@ -5682,33 +5595,6 @@
                 <w:szCs w:val="22"/>
               </w:rPr>
             </w:pPr>
-            <w:r>
-              <w:rPr>
-                <w:rFonts w:ascii="HCI Poppy" w:eastAsia="HY신명조" w:cs="HY신명조"/>
-                <w:spacing w:val="-1"/>
-                <w:sz w:val="22"/>
-                <w:szCs w:val="22"/>
-              </w:rPr>
-              <w:t>□</w:t>
-            </w:r>
-            <w:r>
-              <w:rPr>
-                <w:rFonts w:ascii="HCI Poppy" w:eastAsia="HY신명조" w:cs="HY신명조"/>
-                <w:spacing w:val="-1"/>
-                <w:sz w:val="22"/>
-                <w:szCs w:val="22"/>
-              </w:rPr>
-              <w:t xml:space="preserve"> </w:t>
-            </w:r>
-            <w:r>
-              <w:rPr>
-                <w:rFonts w:ascii="HCI Poppy" w:eastAsia="휴먼명조" w:cs="휴먼명조"/>
-                <w:spacing w:val="-1"/>
-                <w:sz w:val="22"/>
-                <w:szCs w:val="22"/>
-              </w:rPr>
-              <w:t>미동의</w:t>
-            </w:r>
           </w:p>
         </w:tc>
         <w:tc>
@@ -5804,33 +5690,6 @@
                 <w:szCs w:val="22"/>
               </w:rPr>
             </w:pPr>
-            <w:r>
-              <w:rPr>
-                <w:rFonts w:ascii="HCI Poppy" w:eastAsia="HY신명조" w:cs="HY신명조"/>
-                <w:spacing w:val="-1"/>
-                <w:sz w:val="22"/>
-                <w:szCs w:val="22"/>
-              </w:rPr>
-              <w:t>□</w:t>
-            </w:r>
-            <w:r>
-              <w:rPr>
-                <w:rFonts w:ascii="HCI Poppy" w:eastAsia="HY신명조" w:cs="HY신명조"/>
-                <w:spacing w:val="-1"/>
-                <w:sz w:val="22"/>
-                <w:szCs w:val="22"/>
-              </w:rPr>
-              <w:t xml:space="preserve"> </w:t>
-            </w:r>
-            <w:r>
-              <w:rPr>
-                <w:rFonts w:ascii="HCI Poppy" w:eastAsia="휴먼명조" w:cs="휴먼명조"/>
-                <w:spacing w:val="-1"/>
-                <w:sz w:val="22"/>
-                <w:szCs w:val="22"/>
-              </w:rPr>
-              <w:t>동의</w:t>
-            </w:r>
           </w:p>
         </w:tc>
         <w:tc>
@@ -5858,33 +5717,6 @@
                 <w:szCs w:val="22"/>
               </w:rPr>
             </w:pPr>
-            <w:r>
-              <w:rPr>
-                <w:rFonts w:ascii="HCI Poppy" w:eastAsia="HY신명조" w:cs="HY신명조"/>
-                <w:spacing w:val="-1"/>
-                <w:sz w:val="22"/>
-                <w:szCs w:val="22"/>
-              </w:rPr>
-              <w:t>□</w:t>
-            </w:r>
-            <w:r>
-              <w:rPr>
-                <w:rFonts w:ascii="HCI Poppy" w:eastAsia="HY신명조" w:cs="HY신명조"/>
-                <w:spacing w:val="-1"/>
-                <w:sz w:val="22"/>
-                <w:szCs w:val="22"/>
-              </w:rPr>
-              <w:t xml:space="preserve"> </w:t>
-            </w:r>
-            <w:r>
-              <w:rPr>
-                <w:rFonts w:ascii="HCI Poppy" w:eastAsia="휴먼명조" w:cs="휴먼명조"/>
-                <w:spacing w:val="-1"/>
-                <w:sz w:val="22"/>
-                <w:szCs w:val="22"/>
-              </w:rPr>
-              <w:t>미동의</w:t>
-            </w:r>
           </w:p>
         </w:tc>
         <w:tc>
@@ -5980,33 +5812,6 @@
                 <w:szCs w:val="22"/>
               </w:rPr>
             </w:pPr>
-            <w:r>
-              <w:rPr>
-                <w:rFonts w:ascii="HCI Poppy" w:eastAsia="HY신명조" w:cs="HY신명조"/>
-                <w:spacing w:val="-1"/>
-                <w:sz w:val="22"/>
-                <w:szCs w:val="22"/>
-              </w:rPr>
-              <w:t>□</w:t>
-            </w:r>
-            <w:r>
-              <w:rPr>
-                <w:rFonts w:ascii="HCI Poppy" w:eastAsia="HY신명조" w:cs="HY신명조"/>
-                <w:spacing w:val="-1"/>
-                <w:sz w:val="22"/>
-                <w:szCs w:val="22"/>
-              </w:rPr>
-              <w:t xml:space="preserve"> </w:t>
-            </w:r>
-            <w:r>
-              <w:rPr>
-                <w:rFonts w:ascii="HCI Poppy" w:eastAsia="휴먼명조" w:cs="휴먼명조"/>
-                <w:spacing w:val="-1"/>
-                <w:sz w:val="22"/>
-                <w:szCs w:val="22"/>
-              </w:rPr>
-              <w:t>동의</w:t>
-            </w:r>
           </w:p>
         </w:tc>
         <w:tc>
@@ -6034,33 +5839,6 @@
                 <w:szCs w:val="22"/>
               </w:rPr>
             </w:pPr>
-            <w:r>
-              <w:rPr>
-                <w:rFonts w:ascii="HCI Poppy" w:eastAsia="HY신명조" w:cs="HY신명조"/>
-                <w:spacing w:val="-1"/>
-                <w:sz w:val="22"/>
-                <w:szCs w:val="22"/>
-              </w:rPr>
-              <w:t>□</w:t>
-            </w:r>
-            <w:r>
-              <w:rPr>
-                <w:rFonts w:ascii="HCI Poppy" w:eastAsia="HY신명조" w:cs="HY신명조"/>
-                <w:spacing w:val="-1"/>
-                <w:sz w:val="22"/>
-                <w:szCs w:val="22"/>
-              </w:rPr>
-              <w:t xml:space="preserve"> </w:t>
-            </w:r>
-            <w:r>
-              <w:rPr>
-                <w:rFonts w:ascii="HCI Poppy" w:eastAsia="휴먼명조" w:cs="휴먼명조"/>
-                <w:spacing w:val="-1"/>
-                <w:sz w:val="22"/>
-                <w:szCs w:val="22"/>
-              </w:rPr>
-              <w:t>미동의</w:t>
-            </w:r>
           </w:p>
         </w:tc>
         <w:tc>
@@ -6156,33 +5934,6 @@
                 <w:szCs w:val="22"/>
               </w:rPr>
             </w:pPr>
-            <w:r>
-              <w:rPr>
-                <w:rFonts w:ascii="HCI Poppy" w:eastAsia="HY신명조" w:cs="HY신명조"/>
-                <w:spacing w:val="-1"/>
-                <w:sz w:val="22"/>
-                <w:szCs w:val="22"/>
-              </w:rPr>
-              <w:t>□</w:t>
-            </w:r>
-            <w:r>
-              <w:rPr>
-                <w:rFonts w:ascii="HCI Poppy" w:eastAsia="HY신명조" w:cs="HY신명조"/>
-                <w:spacing w:val="-1"/>
-                <w:sz w:val="22"/>
-                <w:szCs w:val="22"/>
-              </w:rPr>
-              <w:t xml:space="preserve"> </w:t>
-            </w:r>
-            <w:r>
-              <w:rPr>
-                <w:rFonts w:ascii="HCI Poppy" w:eastAsia="휴먼명조" w:cs="휴먼명조"/>
-                <w:spacing w:val="-1"/>
-                <w:sz w:val="22"/>
-                <w:szCs w:val="22"/>
-              </w:rPr>
-              <w:t>동의</w:t>
-            </w:r>
           </w:p>
         </w:tc>
         <w:tc>
@@ -6210,33 +5961,6 @@
                 <w:szCs w:val="22"/>
               </w:rPr>
             </w:pPr>
-            <w:r>
-              <w:rPr>
-                <w:rFonts w:ascii="HCI Poppy" w:eastAsia="HY신명조" w:cs="HY신명조"/>
-                <w:spacing w:val="-1"/>
-                <w:sz w:val="22"/>
-                <w:szCs w:val="22"/>
-              </w:rPr>
-              <w:t>□</w:t>
-            </w:r>
-            <w:r>
-              <w:rPr>
-                <w:rFonts w:ascii="HCI Poppy" w:eastAsia="HY신명조" w:cs="HY신명조"/>
-                <w:spacing w:val="-1"/>
-                <w:sz w:val="22"/>
-                <w:szCs w:val="22"/>
-              </w:rPr>
-              <w:t xml:space="preserve"> </w:t>
-            </w:r>
-            <w:r>
-              <w:rPr>
-                <w:rFonts w:ascii="HCI Poppy" w:eastAsia="휴먼명조" w:cs="휴먼명조"/>
-                <w:spacing w:val="-1"/>
-                <w:sz w:val="22"/>
-                <w:szCs w:val="22"/>
-              </w:rPr>
-              <w:t>미동의</w:t>
-            </w:r>
           </w:p>
         </w:tc>
         <w:tc>
@@ -7885,6 +7609,7 @@
         </w:rPr>
         <w:t xml:space="preserve">2026.  </w:t>
       </w:r>
+      <w:proofErr w:type="gramStart"/>
       <w:r>
         <w:rPr>
           <w:rFonts w:ascii="HCI Poppy" w:eastAsiaTheme="minorEastAsia" w:cs="HCI Poppy" w:hint="eastAsia"/>
@@ -7899,15 +7624,33 @@
           <w:sz w:val="28"/>
           <w:szCs w:val="28"/>
         </w:rPr>
-        <w:t xml:space="preserve"> .  </w:t>
+        <w:t xml:space="preserve"> .</w:t>
       </w:r>
+      <w:proofErr w:type="gramEnd"/>
+      <w:r>
+        <w:rPr>
+          <w:rFonts w:ascii="HCI Poppy" w:eastAsia="HCI Poppy" w:cs="HCI Poppy"/>
+          <w:sz w:val="28"/>
+          <w:szCs w:val="28"/>
+        </w:rPr>
+        <w:t xml:space="preserve">  </w:t>
+      </w:r>
+      <w:proofErr w:type="gramStart"/>
       <w:r>
         <w:rPr>
           <w:rFonts w:ascii="HCI Poppy" w:eastAsiaTheme="minorEastAsia" w:cs="HCI Poppy" w:hint="eastAsia"/>
           <w:sz w:val="28"/>
           <w:szCs w:val="28"/>
         </w:rPr>
-        <w:t>10</w:t>
+        <w:t>1</w:t>
+      </w:r>
+      <w:r>
+        <w:rPr>
+          <w:rFonts w:ascii="HCI Poppy" w:eastAsiaTheme="minorEastAsia" w:cs="HCI Poppy" w:hint="eastAsia"/>
+          <w:sz w:val="28"/>
+          <w:szCs w:val="28"/>
+        </w:rPr>
+        <w:t>1</w:t>
       </w:r>
       <w:r>
         <w:rPr>
@@ -7917,6 +7660,7 @@
         </w:rPr>
         <w:t xml:space="preserve"> .</w:t>
       </w:r>
+      <w:proofErr w:type="gramEnd"/>
     </w:p>
     <w:tbl>
       <w:tblPr>
@@ -8014,6 +7758,7 @@
                 <w:szCs w:val="24"/>
               </w:rPr>
             </w:pPr>
+            <w:proofErr w:type="gramStart"/>
             <w:r>
               <w:rPr>
                 <w:rFonts w:ascii="굴림" w:eastAsia="굴림" w:cs="굴림"/>
@@ -8024,6 +7769,7 @@
               </w:rPr>
               <w:t>소  속</w:t>
             </w:r>
+            <w:proofErr w:type="gramEnd"/>
           </w:p>
         </w:tc>
         <w:tc>
@@ -8092,6 +7838,7 @@
                 <w:szCs w:val="24"/>
               </w:rPr>
             </w:pPr>
+            <w:proofErr w:type="gramStart"/>
             <w:r>
               <w:rPr>
                 <w:rFonts w:ascii="굴림" w:eastAsia="굴림" w:cs="굴림"/>
@@ -8100,7 +7847,18 @@
                 <w:sz w:val="24"/>
                 <w:szCs w:val="24"/>
               </w:rPr>
-              <w:t xml:space="preserve">서  명 </w:t>
+              <w:t>서  명</w:t>
+            </w:r>
+            <w:proofErr w:type="gramEnd"/>
+            <w:r>
+              <w:rPr>
+                <w:rFonts w:ascii="굴림" w:eastAsia="굴림" w:cs="굴림"/>
+                <w:b/>
+                <w:bCs/>
+                <w:sz w:val="24"/>
+                <w:szCs w:val="24"/>
+              </w:rPr>
+              <w:t xml:space="preserve"> </w:t>
             </w:r>
           </w:p>
         </w:tc>
@@ -10057,6 +9815,7 @@
   <w:style w:type="character" w:default="1" w:styleId="a0">
     <w:name w:val="Default Paragraph Font"/>
     <w:uiPriority w:val="1"/>
+    <w:semiHidden/>
     <w:unhideWhenUsed/>
   </w:style>
   <w:style w:type="table" w:default="1" w:styleId="a1">
@@ -11516,11 +11275,11 @@
     </inkml:brush>
   </inkml:definitions>
   <inkml:trace contextRef="#ctx0" brushRef="#br0">1 48 24575,'11'1'0,"-1"0"0,1 1 0,0 0 0,-1 1 0,1 1 0,11 4 0,26 8 0,31-1 0,-56-13 0,-1 2 0,0 1 0,0 0 0,28 12 0,-47-15 0,0-1 0,0 1 0,1 0 0,-1 0 0,0 0 0,-1 0 0,1 0 0,0 0 0,-1 1 0,1-1 0,-1 1 0,0 0 0,0 0 0,0 0 0,0 0 0,0 0 0,-1 0 0,1 1 0,-1-1 0,0 1 0,0-1 0,0 0 0,0 1 0,-1 0 0,0-1 0,1 1 0,-1-1 0,0 1 0,-1-1 0,0 8 0,-1-3 0,-1 0 0,1 0 0,-1 0 0,-1-1 0,1 1 0,-1-1 0,-1 0 0,1 0 0,-1 0 0,-1 0 0,1-1 0,-8 6 0,-19 15-273,-1-2 0,-1-2 0,-2-1 0,-65 30 0,74-39-6553</inkml:trace>
-  <inkml:trace contextRef="#ctx0" brushRef="#br0" timeOffset="296.72">355 425 24575,'4'0'0,"17"8"0,22 3 0,14 11 0,3 2 0,-6-3 0,-12-5-8191</inkml:trace>
+  <inkml:trace contextRef="#ctx0" brushRef="#br0" timeOffset="296.71">355 425 24575,'4'0'0,"17"8"0,22 3 0,14 11 0,3 2 0,-6-3 0,-12-5-8191</inkml:trace>
   <inkml:trace contextRef="#ctx0" brushRef="#br0" timeOffset="580.77">684 283 24575,'0'-3'0,"0"-3"-8191</inkml:trace>
   <inkml:trace contextRef="#ctx0" brushRef="#br0" timeOffset="937.03">684 260 24575,'0'8'0,"0"11"0,0 14 0,0 5 0,0 0 0,0 2 0,0 3 0,0 0 0,0-1 0,-4-9 0,-1-10-8191</inkml:trace>
   <inkml:trace contextRef="#ctx0" brushRef="#br0" timeOffset="1269.54">637 424 24575,'0'-4'0,"0"-6"0,0-4 0,4 0 0,6-2 0,0-2 0,3-3 0,-1 4-8191</inkml:trace>
-  <inkml:trace contextRef="#ctx0" brushRef="#br0" timeOffset="2148.78">707 471 24575,'4'0'0,"6"0"0,4 0 0,5 0 0,2 0 0,2-4 0,1-1 0,-3-5 0,-2 1 0,5 1 0,-3-2 0,-4 1-8191</inkml:trace>
+  <inkml:trace contextRef="#ctx0" brushRef="#br0" timeOffset="2148.77">707 471 24575,'4'0'0,"6"0"0,4 0 0,5 0 0,2 0 0,2-4 0,1-1 0,-3-5 0,-2 1 0,5 1 0,-3-2 0,-4 1-8191</inkml:trace>
   <inkml:trace contextRef="#ctx0" brushRef="#br0" timeOffset="2690.77">965 0 24575,'0'4'0,"0"10"0,0 5 0,8 13 0,3 8 0,-1 6 0,-2-2 0,-2-3 0,-3-6 0,-1-4 0,-1-3 0,-1-7-8191</inkml:trace>
 </inkml:ink>
 </file>

</xml_diff>

<commit_message>
docs: update competition submission package
</commit_message>
<xml_diff>
--- a/01_경진대회_개인정보수집동의서+및+참가+서약서.docx
+++ b/01_경진대회_개인정보수집동의서+및+참가+서약서.docx
@@ -294,7 +294,27 @@
                 <w:sz w:val="24"/>
                 <w:szCs w:val="24"/>
               </w:rPr>
-              <w:t>농촌 공공데이터+AI 활용 창업경진대회』에 참가함에 있어, 다음 각 호의</w:t>
+              <w:t xml:space="preserve">농촌 공공데이터+AI 활용 </w:t>
+            </w:r>
+            <w:proofErr w:type="spellStart"/>
+            <w:r>
+              <w:rPr>
+                <w:rFonts w:ascii="굴림" w:eastAsia="굴림" w:cs="굴림"/>
+                <w:spacing w:val="-4"/>
+                <w:sz w:val="24"/>
+                <w:szCs w:val="24"/>
+              </w:rPr>
+              <w:t>창업경진대회』에</w:t>
+            </w:r>
+            <w:proofErr w:type="spellEnd"/>
+            <w:r>
+              <w:rPr>
+                <w:rFonts w:ascii="굴림" w:eastAsia="굴림" w:cs="굴림"/>
+                <w:spacing w:val="-4"/>
+                <w:sz w:val="24"/>
+                <w:szCs w:val="24"/>
+              </w:rPr>
+              <w:t xml:space="preserve"> 참가함에 있어, 다음 각 호의</w:t>
             </w:r>
             <w:r>
               <w:rPr>
@@ -375,7 +395,47 @@
                 <w:sz w:val="24"/>
                 <w:szCs w:val="24"/>
               </w:rPr>
-              <w:t>출품작에 대한 저작권으로 인하여 발생하는 민ㆍ형사상 책임은 출품자(팀)에게 있다.</w:t>
+              <w:t xml:space="preserve">출품작에 대한 저작권으로 인하여 발생하는 </w:t>
+            </w:r>
+            <w:proofErr w:type="spellStart"/>
+            <w:r>
+              <w:rPr>
+                <w:rFonts w:ascii="굴림" w:eastAsia="굴림" w:cs="굴림"/>
+                <w:spacing w:val="-12"/>
+                <w:sz w:val="24"/>
+                <w:szCs w:val="24"/>
+              </w:rPr>
+              <w:t>민ㆍ형사상</w:t>
+            </w:r>
+            <w:proofErr w:type="spellEnd"/>
+            <w:r>
+              <w:rPr>
+                <w:rFonts w:ascii="굴림" w:eastAsia="굴림" w:cs="굴림"/>
+                <w:spacing w:val="-12"/>
+                <w:sz w:val="24"/>
+                <w:szCs w:val="24"/>
+              </w:rPr>
+              <w:t xml:space="preserve"> 책임은 </w:t>
+            </w:r>
+            <w:proofErr w:type="spellStart"/>
+            <w:r>
+              <w:rPr>
+                <w:rFonts w:ascii="굴림" w:eastAsia="굴림" w:cs="굴림"/>
+                <w:spacing w:val="-12"/>
+                <w:sz w:val="24"/>
+                <w:szCs w:val="24"/>
+              </w:rPr>
+              <w:t>출품자</w:t>
+            </w:r>
+            <w:proofErr w:type="spellEnd"/>
+            <w:r>
+              <w:rPr>
+                <w:rFonts w:ascii="굴림" w:eastAsia="굴림" w:cs="굴림"/>
+                <w:spacing w:val="-12"/>
+                <w:sz w:val="24"/>
+                <w:szCs w:val="24"/>
+              </w:rPr>
+              <w:t>(팀)에게 있다.</w:t>
             </w:r>
           </w:p>
           <w:p>
@@ -447,25 +507,7 @@
                 <w:sz w:val="24"/>
                 <w:szCs w:val="24"/>
               </w:rPr>
-              <w:t xml:space="preserve">    서약서 및 신청서 내용이 사실임을 확인하며, 허위사실 기재 등으로 인하여 어떠한 문제가 </w:t>
-            </w:r>
-            <w:proofErr w:type="gramStart"/>
-            <w:r>
-              <w:rPr>
-                <w:rFonts w:ascii="굴림" w:eastAsia="굴림" w:cs="굴림"/>
-                <w:sz w:val="24"/>
-                <w:szCs w:val="24"/>
-              </w:rPr>
-              <w:t>발생 했을</w:t>
-            </w:r>
-            <w:proofErr w:type="gramEnd"/>
-            <w:r>
-              <w:rPr>
-                <w:rFonts w:ascii="굴림" w:eastAsia="굴림" w:cs="굴림"/>
-                <w:sz w:val="24"/>
-                <w:szCs w:val="24"/>
-              </w:rPr>
-              <w:t xml:space="preserve"> 시 모든 책임은 본인에게 있음을 확인합니다.</w:t>
+              <w:t xml:space="preserve">    서약서 및 신청서 내용이 사실임을 확인하며, 허위사실 기재 등으로 인하여 어떠한 문제가 발생 했을 시 모든 책임은 본인에게 있음을 확인합니다.</w:t>
             </w:r>
           </w:p>
           <w:p>
@@ -512,7 +554,6 @@
               </w:rPr>
               <w:t xml:space="preserve">                                  2026년    </w:t>
             </w:r>
-            <w:proofErr w:type="gramStart"/>
             <w:r>
               <w:rPr>
                 <w:rFonts w:ascii="굴림" w:eastAsia="굴림" w:cs="굴림" w:hint="eastAsia"/>
@@ -527,18 +568,8 @@
                 <w:sz w:val="24"/>
                 <w:szCs w:val="24"/>
               </w:rPr>
-              <w:t xml:space="preserve">  월</w:t>
-            </w:r>
-            <w:proofErr w:type="gramEnd"/>
-            <w:r>
-              <w:rPr>
-                <w:rFonts w:ascii="굴림" w:eastAsia="굴림" w:cs="굴림"/>
-                <w:sz w:val="24"/>
-                <w:szCs w:val="24"/>
-              </w:rPr>
-              <w:t xml:space="preserve">    </w:t>
-            </w:r>
-            <w:proofErr w:type="gramStart"/>
+              <w:t xml:space="preserve">  월    </w:t>
+            </w:r>
             <w:r>
               <w:rPr>
                 <w:rFonts w:ascii="굴림" w:eastAsia="굴림" w:cs="굴림" w:hint="eastAsia"/>
@@ -561,16 +592,7 @@
                 <w:sz w:val="24"/>
                 <w:szCs w:val="24"/>
               </w:rPr>
-              <w:t xml:space="preserve">  일</w:t>
-            </w:r>
-            <w:proofErr w:type="gramEnd"/>
-            <w:r>
-              <w:rPr>
-                <w:rFonts w:ascii="굴림" w:eastAsia="굴림" w:cs="굴림"/>
-                <w:sz w:val="24"/>
-                <w:szCs w:val="24"/>
-              </w:rPr>
-              <w:t xml:space="preserve">  </w:t>
+              <w:t xml:space="preserve">  일  </w:t>
             </w:r>
           </w:p>
           <w:p>
@@ -664,6 +686,7 @@
               </w:rPr>
               <w:t xml:space="preserve">                                신청인(대표자)         </w:t>
             </w:r>
+            <w:proofErr w:type="spellStart"/>
             <w:r>
               <w:rPr>
                 <w:rFonts w:ascii="굴림" w:eastAsia="굴림" w:cs="굴림" w:hint="eastAsia"/>
@@ -672,6 +695,7 @@
               </w:rPr>
               <w:t>유창재</w:t>
             </w:r>
+            <w:proofErr w:type="spellEnd"/>
             <w:r>
               <w:rPr>
                 <w:rFonts w:ascii="굴림" w:eastAsia="굴림" w:cs="굴림"/>
@@ -729,7 +753,31 @@
                 <w:sz w:val="28"/>
                 <w:szCs w:val="28"/>
               </w:rPr>
-              <w:t xml:space="preserve">  농림수산식품교육문화정보원장 귀하</w:t>
+              <w:t xml:space="preserve">  </w:t>
+            </w:r>
+            <w:proofErr w:type="spellStart"/>
+            <w:r>
+              <w:rPr>
+                <w:rFonts w:ascii="굴림" w:eastAsia="굴림" w:cs="굴림"/>
+                <w:b/>
+                <w:bCs/>
+                <w:w w:val="95"/>
+                <w:sz w:val="28"/>
+                <w:szCs w:val="28"/>
+              </w:rPr>
+              <w:t>농림수산식품교육문화정보원장</w:t>
+            </w:r>
+            <w:proofErr w:type="spellEnd"/>
+            <w:r>
+              <w:rPr>
+                <w:rFonts w:ascii="굴림" w:eastAsia="굴림" w:cs="굴림"/>
+                <w:b/>
+                <w:bCs/>
+                <w:w w:val="95"/>
+                <w:sz w:val="28"/>
+                <w:szCs w:val="28"/>
+              </w:rPr>
+              <w:t xml:space="preserve"> 귀하</w:t>
             </w:r>
           </w:p>
           <w:p>
@@ -1245,13 +1293,23 @@
                 <w:szCs w:val="24"/>
               </w:rPr>
             </w:pPr>
-            <w:r>
-              <w:rPr>
-                <w:rFonts w:ascii="굴림" w:eastAsia="굴림" w:cs="굴림"/>
-                <w:sz w:val="24"/>
-                <w:szCs w:val="24"/>
-              </w:rPr>
-              <w:t>농림수산식품교육문화정보원(이하</w:t>
+            <w:proofErr w:type="spellStart"/>
+            <w:r>
+              <w:rPr>
+                <w:rFonts w:ascii="굴림" w:eastAsia="굴림" w:cs="굴림"/>
+                <w:sz w:val="24"/>
+                <w:szCs w:val="24"/>
+              </w:rPr>
+              <w:t>농림수산식품교육문화정보원</w:t>
+            </w:r>
+            <w:proofErr w:type="spellEnd"/>
+            <w:r>
+              <w:rPr>
+                <w:rFonts w:ascii="굴림" w:eastAsia="굴림" w:cs="굴림"/>
+                <w:sz w:val="24"/>
+                <w:szCs w:val="24"/>
+              </w:rPr>
+              <w:t>(이하</w:t>
             </w:r>
             <w:r>
               <w:rPr>
@@ -1261,6 +1319,7 @@
               </w:rPr>
               <w:t>‘</w:t>
             </w:r>
+            <w:proofErr w:type="spellStart"/>
             <w:r>
               <w:rPr>
                 <w:rFonts w:ascii="굴림" w:eastAsia="굴림" w:cs="굴림"/>
@@ -1269,6 +1328,7 @@
               </w:rPr>
               <w:t>농정원</w:t>
             </w:r>
+            <w:proofErr w:type="spellEnd"/>
             <w:r>
               <w:rPr>
                 <w:rFonts w:ascii="굴림" w:eastAsia="굴림" w:cs="굴림"/>
@@ -2241,25 +2301,7 @@
                 <w:sz w:val="24"/>
                 <w:szCs w:val="24"/>
               </w:rPr>
-              <w:t xml:space="preserve">      - 보존 </w:t>
-            </w:r>
-            <w:proofErr w:type="gramStart"/>
-            <w:r>
-              <w:rPr>
-                <w:rFonts w:ascii="굴림" w:eastAsia="굴림" w:cs="굴림"/>
-                <w:sz w:val="24"/>
-                <w:szCs w:val="24"/>
-              </w:rPr>
-              <w:t>이유 :</w:t>
-            </w:r>
-            <w:proofErr w:type="gramEnd"/>
-            <w:r>
-              <w:rPr>
-                <w:rFonts w:ascii="굴림" w:eastAsia="굴림" w:cs="굴림"/>
-                <w:sz w:val="24"/>
-                <w:szCs w:val="24"/>
-              </w:rPr>
-              <w:t xml:space="preserve"> 참가자 관리 및 후속지원</w:t>
+              <w:t xml:space="preserve">      - 보존 이유 : 참가자 관리 및 후속지원</w:t>
             </w:r>
           </w:p>
           <w:p>
@@ -2293,21 +2335,34 @@
                 <w:szCs w:val="24"/>
                 <w:u w:val="single" w:color="000000"/>
               </w:rPr>
-              <w:t xml:space="preserve">보존 </w:t>
-            </w:r>
-            <w:proofErr w:type="gramStart"/>
-            <w:r>
+              <w:t>보존 기간 : 당해 연도 경진대회 결선 결과발표 후 3년 간</w:t>
+            </w:r>
+          </w:p>
+          <w:p>
+            <w:pPr>
+              <w:pStyle w:val="a8"/>
+              <w:spacing w:line="240" w:lineRule="auto"/>
+              <w:ind w:left="611" w:right="120" w:hanging="491"/>
+              <w:rPr>
+                <w:rFonts w:ascii="굴림" w:eastAsia="굴림" w:cs="굴림"/>
+                <w:sz w:val="24"/>
+                <w:szCs w:val="24"/>
+              </w:rPr>
+            </w:pPr>
+          </w:p>
+          <w:p>
+            <w:pPr>
+              <w:pStyle w:val="a8"/>
+              <w:spacing w:line="240" w:lineRule="auto"/>
+              <w:ind w:left="611" w:right="120" w:hanging="491"/>
               <w:rPr>
                 <w:rFonts w:ascii="굴림" w:eastAsia="굴림" w:cs="굴림"/>
                 <w:b/>
                 <w:bCs/>
                 <w:sz w:val="24"/>
                 <w:szCs w:val="24"/>
-                <w:u w:val="single" w:color="000000"/>
-              </w:rPr>
-              <w:t>기간 :</w:t>
-            </w:r>
-            <w:proofErr w:type="gramEnd"/>
+              </w:rPr>
+            </w:pPr>
             <w:r>
               <w:rPr>
                 <w:rFonts w:ascii="굴림" w:eastAsia="굴림" w:cs="굴림"/>
@@ -2315,43 +2370,6 @@
                 <w:bCs/>
                 <w:sz w:val="24"/>
                 <w:szCs w:val="24"/>
-                <w:u w:val="single" w:color="000000"/>
-              </w:rPr>
-              <w:t xml:space="preserve"> 당해 연도 경진대회 결선 결과발표 후 3년 간</w:t>
-            </w:r>
-          </w:p>
-          <w:p>
-            <w:pPr>
-              <w:pStyle w:val="a8"/>
-              <w:spacing w:line="240" w:lineRule="auto"/>
-              <w:ind w:left="611" w:right="120" w:hanging="491"/>
-              <w:rPr>
-                <w:rFonts w:ascii="굴림" w:eastAsia="굴림" w:cs="굴림"/>
-                <w:sz w:val="24"/>
-                <w:szCs w:val="24"/>
-              </w:rPr>
-            </w:pPr>
-          </w:p>
-          <w:p>
-            <w:pPr>
-              <w:pStyle w:val="a8"/>
-              <w:spacing w:line="240" w:lineRule="auto"/>
-              <w:ind w:left="611" w:right="120" w:hanging="491"/>
-              <w:rPr>
-                <w:rFonts w:ascii="굴림" w:eastAsia="굴림" w:cs="굴림"/>
-                <w:b/>
-                <w:bCs/>
-                <w:sz w:val="24"/>
-                <w:szCs w:val="24"/>
-              </w:rPr>
-            </w:pPr>
-            <w:r>
-              <w:rPr>
-                <w:rFonts w:ascii="굴림" w:eastAsia="굴림" w:cs="굴림"/>
-                <w:b/>
-                <w:bCs/>
-                <w:sz w:val="24"/>
-                <w:szCs w:val="24"/>
               </w:rPr>
               <w:t>6. 참가자 및 법정 대리인의 권리와 그 행사방법</w:t>
             </w:r>
@@ -2521,13 +2539,23 @@
               </w:rPr>
               <w:t>”</w:t>
             </w:r>
-            <w:r>
-              <w:rPr>
-                <w:rFonts w:ascii="굴림" w:eastAsia="굴림" w:cs="굴림"/>
-                <w:sz w:val="24"/>
-                <w:szCs w:val="24"/>
-              </w:rPr>
-              <w:t>에 명시된 바에 따라 처리하고 그 외의 용도로 열람 또는 이용할 수 없도록 처리하고 있습니다.</w:t>
+            <w:proofErr w:type="spellStart"/>
+            <w:r>
+              <w:rPr>
+                <w:rFonts w:ascii="굴림" w:eastAsia="굴림" w:cs="굴림"/>
+                <w:sz w:val="24"/>
+                <w:szCs w:val="24"/>
+              </w:rPr>
+              <w:t>에</w:t>
+            </w:r>
+            <w:proofErr w:type="spellEnd"/>
+            <w:r>
+              <w:rPr>
+                <w:rFonts w:ascii="굴림" w:eastAsia="굴림" w:cs="굴림"/>
+                <w:sz w:val="24"/>
+                <w:szCs w:val="24"/>
+              </w:rPr>
+              <w:t xml:space="preserve"> 명시된 바에 따라 처리하고 그 외의 용도로 열람 또는 이용할 수 없도록 처리하고 있습니다.</w:t>
             </w:r>
           </w:p>
           <w:p>
@@ -2827,7 +2855,6 @@
         </w:rPr>
         <w:t xml:space="preserve">2026.  </w:t>
       </w:r>
-      <w:proofErr w:type="gramStart"/>
       <w:r>
         <w:rPr>
           <w:rFonts w:ascii="HCI Poppy" w:eastAsiaTheme="minorEastAsia" w:cs="HCI Poppy" w:hint="eastAsia"/>
@@ -2842,43 +2869,32 @@
           <w:sz w:val="28"/>
           <w:szCs w:val="28"/>
         </w:rPr>
-        <w:t xml:space="preserve">  .</w:t>
+        <w:t xml:space="preserve">  .   </w:t>
       </w:r>
-      <w:proofErr w:type="gramEnd"/>
+      <w:r>
+        <w:rPr>
+          <w:rFonts w:ascii="HCI Poppy" w:eastAsiaTheme="minorEastAsia" w:cs="HCI Poppy" w:hint="eastAsia"/>
+          <w:sz w:val="28"/>
+          <w:szCs w:val="28"/>
+        </w:rPr>
+        <w:t>1</w:t>
+      </w:r>
+      <w:r>
+        <w:rPr>
+          <w:rFonts w:ascii="HCI Poppy" w:eastAsiaTheme="minorEastAsia" w:cs="HCI Poppy" w:hint="eastAsia"/>
+          <w:sz w:val="28"/>
+          <w:szCs w:val="28"/>
+        </w:rPr>
+        <w:t>1</w:t>
+      </w:r>
       <w:r>
         <w:rPr>
           <w:rFonts w:ascii="HCI Poppy" w:eastAsia="HCI Poppy" w:cs="HCI Poppy"/>
           <w:sz w:val="28"/>
           <w:szCs w:val="28"/>
         </w:rPr>
-        <w:t xml:space="preserve">   </w:t>
-      </w:r>
-      <w:proofErr w:type="gramStart"/>
-      <w:r>
-        <w:rPr>
-          <w:rFonts w:ascii="HCI Poppy" w:eastAsiaTheme="minorEastAsia" w:cs="HCI Poppy" w:hint="eastAsia"/>
-          <w:sz w:val="28"/>
-          <w:szCs w:val="28"/>
-        </w:rPr>
-        <w:t>1</w:t>
-      </w:r>
-      <w:r>
-        <w:rPr>
-          <w:rFonts w:ascii="HCI Poppy" w:eastAsiaTheme="minorEastAsia" w:cs="HCI Poppy" w:hint="eastAsia"/>
-          <w:sz w:val="28"/>
-          <w:szCs w:val="28"/>
-        </w:rPr>
-        <w:t>1</w:t>
-      </w:r>
-      <w:r>
-        <w:rPr>
-          <w:rFonts w:ascii="HCI Poppy" w:eastAsia="HCI Poppy" w:cs="HCI Poppy"/>
-          <w:sz w:val="28"/>
-          <w:szCs w:val="28"/>
-        </w:rPr>
         <w:t xml:space="preserve">  .</w:t>
       </w:r>
-      <w:proofErr w:type="gramEnd"/>
     </w:p>
     <w:tbl>
       <w:tblPr>
@@ -2976,7 +2992,6 @@
                 <w:szCs w:val="24"/>
               </w:rPr>
             </w:pPr>
-            <w:proofErr w:type="gramStart"/>
             <w:r>
               <w:rPr>
                 <w:rFonts w:ascii="굴림" w:eastAsia="굴림" w:cs="굴림"/>
@@ -2987,7 +3002,6 @@
               </w:rPr>
               <w:t>소  속</w:t>
             </w:r>
-            <w:proofErr w:type="gramEnd"/>
           </w:p>
         </w:tc>
         <w:tc>
@@ -3056,7 +3070,6 @@
                 <w:szCs w:val="24"/>
               </w:rPr>
             </w:pPr>
-            <w:proofErr w:type="gramStart"/>
             <w:r>
               <w:rPr>
                 <w:rFonts w:ascii="굴림" w:eastAsia="굴림" w:cs="굴림"/>
@@ -3065,18 +3078,7 @@
                 <w:sz w:val="24"/>
                 <w:szCs w:val="24"/>
               </w:rPr>
-              <w:t>서  명</w:t>
-            </w:r>
-            <w:proofErr w:type="gramEnd"/>
-            <w:r>
-              <w:rPr>
-                <w:rFonts w:ascii="굴림" w:eastAsia="굴림" w:cs="굴림"/>
-                <w:b/>
-                <w:bCs/>
-                <w:sz w:val="24"/>
-                <w:szCs w:val="24"/>
-              </w:rPr>
-              <w:t xml:space="preserve"> </w:t>
+              <w:t xml:space="preserve">서  명 </w:t>
             </w:r>
           </w:p>
         </w:tc>
@@ -3239,12 +3241,14 @@
               <w:wordWrap/>
               <w:jc w:val="center"/>
             </w:pPr>
+            <w:proofErr w:type="spellStart"/>
             <w:r>
               <w:rPr>
                 <w:rFonts w:hint="eastAsia"/>
               </w:rPr>
               <w:t>유창재</w:t>
             </w:r>
+            <w:proofErr w:type="spellEnd"/>
           </w:p>
         </w:tc>
         <w:tc>
@@ -4002,7 +4006,25 @@
                 <w:sz w:val="24"/>
                 <w:szCs w:val="24"/>
               </w:rPr>
-              <w:t>경진대회 참가자 관리 및 후속지원 등을 보다 원활히 제공하기 위해 아래와 같이귀하의 개인정보를 제3자에게 제공하고 있습니다.</w:t>
+              <w:t xml:space="preserve">경진대회 참가자 관리 및 후속지원 등을 보다 원활히 제공하기 위해 아래와 </w:t>
+            </w:r>
+            <w:proofErr w:type="spellStart"/>
+            <w:r>
+              <w:rPr>
+                <w:rFonts w:ascii="굴림" w:eastAsia="굴림" w:cs="굴림"/>
+                <w:sz w:val="24"/>
+                <w:szCs w:val="24"/>
+              </w:rPr>
+              <w:t>같이귀하의</w:t>
+            </w:r>
+            <w:proofErr w:type="spellEnd"/>
+            <w:r>
+              <w:rPr>
+                <w:rFonts w:ascii="굴림" w:eastAsia="굴림" w:cs="굴림"/>
+                <w:sz w:val="24"/>
+                <w:szCs w:val="24"/>
+              </w:rPr>
+              <w:t xml:space="preserve"> 개인정보를 제3자에게 제공하고 있습니다.</w:t>
             </w:r>
           </w:p>
           <w:p>
@@ -4997,7 +5019,6 @@
         </w:rPr>
         <w:t xml:space="preserve">2026.   </w:t>
       </w:r>
-      <w:proofErr w:type="gramStart"/>
       <w:r>
         <w:rPr>
           <w:rFonts w:ascii="HCI Poppy" w:eastAsiaTheme="minorEastAsia" w:cs="HCI Poppy" w:hint="eastAsia"/>
@@ -5012,43 +5033,32 @@
           <w:sz w:val="28"/>
           <w:szCs w:val="28"/>
         </w:rPr>
-        <w:t xml:space="preserve"> .</w:t>
+        <w:t xml:space="preserve"> .   </w:t>
       </w:r>
-      <w:proofErr w:type="gramEnd"/>
+      <w:r>
+        <w:rPr>
+          <w:rFonts w:ascii="HCI Poppy" w:eastAsiaTheme="minorEastAsia" w:cs="HCI Poppy" w:hint="eastAsia"/>
+          <w:sz w:val="28"/>
+          <w:szCs w:val="28"/>
+        </w:rPr>
+        <w:t>1</w:t>
+      </w:r>
+      <w:r>
+        <w:rPr>
+          <w:rFonts w:ascii="HCI Poppy" w:eastAsiaTheme="minorEastAsia" w:cs="HCI Poppy" w:hint="eastAsia"/>
+          <w:sz w:val="28"/>
+          <w:szCs w:val="28"/>
+        </w:rPr>
+        <w:t>1</w:t>
+      </w:r>
       <w:r>
         <w:rPr>
           <w:rFonts w:ascii="HCI Poppy" w:eastAsia="HCI Poppy" w:cs="HCI Poppy"/>
           <w:sz w:val="28"/>
           <w:szCs w:val="28"/>
         </w:rPr>
-        <w:t xml:space="preserve">   </w:t>
-      </w:r>
-      <w:proofErr w:type="gramStart"/>
-      <w:r>
-        <w:rPr>
-          <w:rFonts w:ascii="HCI Poppy" w:eastAsiaTheme="minorEastAsia" w:cs="HCI Poppy" w:hint="eastAsia"/>
-          <w:sz w:val="28"/>
-          <w:szCs w:val="28"/>
-        </w:rPr>
-        <w:t>1</w:t>
-      </w:r>
-      <w:r>
-        <w:rPr>
-          <w:rFonts w:ascii="HCI Poppy" w:eastAsiaTheme="minorEastAsia" w:cs="HCI Poppy" w:hint="eastAsia"/>
-          <w:sz w:val="28"/>
-          <w:szCs w:val="28"/>
-        </w:rPr>
-        <w:t>1</w:t>
-      </w:r>
-      <w:r>
-        <w:rPr>
-          <w:rFonts w:ascii="HCI Poppy" w:eastAsia="HCI Poppy" w:cs="HCI Poppy"/>
-          <w:sz w:val="28"/>
-          <w:szCs w:val="28"/>
-        </w:rPr>
         <w:t xml:space="preserve">  .</w:t>
       </w:r>
-      <w:proofErr w:type="gramEnd"/>
     </w:p>
     <w:tbl>
       <w:tblPr>
@@ -5146,7 +5156,6 @@
                 <w:szCs w:val="24"/>
               </w:rPr>
             </w:pPr>
-            <w:proofErr w:type="gramStart"/>
             <w:r>
               <w:rPr>
                 <w:rFonts w:ascii="굴림" w:eastAsia="굴림" w:cs="굴림"/>
@@ -5157,7 +5166,6 @@
               </w:rPr>
               <w:t>소  속</w:t>
             </w:r>
-            <w:proofErr w:type="gramEnd"/>
           </w:p>
         </w:tc>
         <w:tc>
@@ -5226,7 +5234,6 @@
                 <w:szCs w:val="24"/>
               </w:rPr>
             </w:pPr>
-            <w:proofErr w:type="gramStart"/>
             <w:r>
               <w:rPr>
                 <w:rFonts w:ascii="굴림" w:eastAsia="굴림" w:cs="굴림"/>
@@ -5235,18 +5242,7 @@
                 <w:sz w:val="24"/>
                 <w:szCs w:val="24"/>
               </w:rPr>
-              <w:t>서  명</w:t>
-            </w:r>
-            <w:proofErr w:type="gramEnd"/>
-            <w:r>
-              <w:rPr>
-                <w:rFonts w:ascii="굴림" w:eastAsia="굴림" w:cs="굴림"/>
-                <w:b/>
-                <w:bCs/>
-                <w:sz w:val="24"/>
-                <w:szCs w:val="24"/>
-              </w:rPr>
-              <w:t xml:space="preserve"> </w:t>
+              <w:t xml:space="preserve">서  명 </w:t>
             </w:r>
           </w:p>
         </w:tc>
@@ -5409,12 +5405,14 @@
               <w:wordWrap/>
               <w:jc w:val="center"/>
             </w:pPr>
+            <w:proofErr w:type="spellStart"/>
             <w:r>
               <w:rPr>
                 <w:rFonts w:hint="eastAsia"/>
               </w:rPr>
               <w:t>유창재</w:t>
             </w:r>
+            <w:proofErr w:type="spellEnd"/>
           </w:p>
         </w:tc>
         <w:tc>
@@ -6646,7 +6644,25 @@
                 <w:sz w:val="24"/>
                 <w:szCs w:val="24"/>
               </w:rPr>
-              <w:t>1. 응모된 작품에 대한 저작권(저작재산권과 저작인격권)은 저작자인 응모자에게 원시적으로 귀속됨을 원칙으로 합니다. (「저작권법」제10조)</w:t>
+              <w:t>1. 응모된 작품에 대한 저작권(저작재산권과 저작인격권)은 저작자인 응모자에게 원시적으로 귀속됨을 원칙으로 합니다. (「</w:t>
+            </w:r>
+            <w:proofErr w:type="spellStart"/>
+            <w:r>
+              <w:rPr>
+                <w:rFonts w:ascii="굴림" w:eastAsia="굴림" w:cs="굴림"/>
+                <w:sz w:val="24"/>
+                <w:szCs w:val="24"/>
+              </w:rPr>
+              <w:t>저작권법」제</w:t>
+            </w:r>
+            <w:proofErr w:type="spellEnd"/>
+            <w:r>
+              <w:rPr>
+                <w:rFonts w:ascii="굴림" w:eastAsia="굴림" w:cs="굴림"/>
+                <w:sz w:val="24"/>
+                <w:szCs w:val="24"/>
+              </w:rPr>
+              <w:t>10조)</w:t>
             </w:r>
           </w:p>
           <w:p>
@@ -6879,7 +6895,27 @@
                 <w:sz w:val="24"/>
                 <w:szCs w:val="24"/>
               </w:rPr>
-              <w:t xml:space="preserve">이 외 비공익(영리 목적) 또는 2차 저작권 작성 목적의 이용 </w:t>
+              <w:t xml:space="preserve">이 외 </w:t>
+            </w:r>
+            <w:proofErr w:type="spellStart"/>
+            <w:r>
+              <w:rPr>
+                <w:rFonts w:ascii="굴림" w:eastAsia="굴림" w:cs="굴림"/>
+                <w:spacing w:val="1"/>
+                <w:sz w:val="24"/>
+                <w:szCs w:val="24"/>
+              </w:rPr>
+              <w:t>비공익</w:t>
+            </w:r>
+            <w:proofErr w:type="spellEnd"/>
+            <w:r>
+              <w:rPr>
+                <w:rFonts w:ascii="굴림" w:eastAsia="굴림" w:cs="굴림"/>
+                <w:spacing w:val="1"/>
+                <w:sz w:val="24"/>
+                <w:szCs w:val="24"/>
+              </w:rPr>
+              <w:t xml:space="preserve">(영리 목적) 또는 2차 저작권 작성 목적의 이용 </w:t>
             </w:r>
             <w:r>
               <w:rPr>
@@ -6897,7 +6933,27 @@
                 <w:sz w:val="24"/>
                 <w:szCs w:val="24"/>
               </w:rPr>
-              <w:t>우 「저작권법」에 따라 입상자와 별도로 합의하여 진행합니다.</w:t>
+              <w:t>우 「</w:t>
+            </w:r>
+            <w:proofErr w:type="spellStart"/>
+            <w:r>
+              <w:rPr>
+                <w:rFonts w:ascii="굴림" w:eastAsia="굴림" w:cs="굴림"/>
+                <w:spacing w:val="-3"/>
+                <w:sz w:val="24"/>
+                <w:szCs w:val="24"/>
+              </w:rPr>
+              <w:t>저작권법」에</w:t>
+            </w:r>
+            <w:proofErr w:type="spellEnd"/>
+            <w:r>
+              <w:rPr>
+                <w:rFonts w:ascii="굴림" w:eastAsia="굴림" w:cs="굴림"/>
+                <w:spacing w:val="-3"/>
+                <w:sz w:val="24"/>
+                <w:szCs w:val="24"/>
+              </w:rPr>
+              <w:t xml:space="preserve"> 따라 입상자와 별도로 합의하여 진행합니다.</w:t>
             </w:r>
           </w:p>
           <w:p>
@@ -7035,6 +7091,7 @@
               </w:rPr>
               <w:t xml:space="preserve">4. </w:t>
             </w:r>
+            <w:proofErr w:type="spellStart"/>
             <w:r>
               <w:rPr>
                 <w:rFonts w:ascii="굴림" w:eastAsia="굴림" w:cs="굴림"/>
@@ -7051,8 +7108,19 @@
                 <w:sz w:val="24"/>
                 <w:szCs w:val="24"/>
               </w:rPr>
-              <w:t xml:space="preserve">거년도 </w:t>
-            </w:r>
+              <w:t>거년도</w:t>
+            </w:r>
+            <w:proofErr w:type="spellEnd"/>
+            <w:r>
+              <w:rPr>
+                <w:rFonts w:ascii="굴림" w:eastAsia="굴림" w:cs="굴림"/>
+                <w:spacing w:val="-4"/>
+                <w:sz w:val="24"/>
+                <w:szCs w:val="24"/>
+              </w:rPr>
+              <w:t xml:space="preserve"> </w:t>
+            </w:r>
+            <w:proofErr w:type="spellStart"/>
             <w:r>
               <w:rPr>
                 <w:rFonts w:ascii="굴림" w:eastAsia="굴림" w:cs="굴림"/>
@@ -7060,7 +7128,37 @@
                 <w:sz w:val="24"/>
                 <w:szCs w:val="24"/>
               </w:rPr>
-              <w:t xml:space="preserve">농식품 공공빅데이터 활용 경진대회 </w:t>
+              <w:t>농식품</w:t>
+            </w:r>
+            <w:proofErr w:type="spellEnd"/>
+            <w:r>
+              <w:rPr>
+                <w:rFonts w:ascii="굴림" w:eastAsia="굴림" w:cs="굴림"/>
+                <w:spacing w:val="-3"/>
+                <w:sz w:val="24"/>
+                <w:szCs w:val="24"/>
+              </w:rPr>
+              <w:t xml:space="preserve"> </w:t>
+            </w:r>
+            <w:proofErr w:type="spellStart"/>
+            <w:r>
+              <w:rPr>
+                <w:rFonts w:ascii="굴림" w:eastAsia="굴림" w:cs="굴림"/>
+                <w:spacing w:val="-3"/>
+                <w:sz w:val="24"/>
+                <w:szCs w:val="24"/>
+              </w:rPr>
+              <w:t>공공빅데이터</w:t>
+            </w:r>
+            <w:proofErr w:type="spellEnd"/>
+            <w:r>
+              <w:rPr>
+                <w:rFonts w:ascii="굴림" w:eastAsia="굴림" w:cs="굴림"/>
+                <w:spacing w:val="-3"/>
+                <w:sz w:val="24"/>
+                <w:szCs w:val="24"/>
+              </w:rPr>
+              <w:t xml:space="preserve"> 활용 경진대회 </w:t>
             </w:r>
             <w:r>
               <w:rPr>
@@ -7286,7 +7384,31 @@
                 <w:sz w:val="24"/>
                 <w:szCs w:val="24"/>
               </w:rPr>
-              <w:t>기타 저작권 관련 사항은 「저작권법」 및 「문화체육관광부 창작물 공모전 지침」을 준</w:t>
+              <w:t xml:space="preserve">기타 저작권 관련 사항은 「저작권법」 및 「문화체육관광부 창작물 공모전 </w:t>
+            </w:r>
+            <w:proofErr w:type="spellStart"/>
+            <w:r>
+              <w:rPr>
+                <w:rFonts w:ascii="굴림" w:eastAsia="굴림" w:cs="굴림"/>
+                <w:b/>
+                <w:bCs/>
+                <w:spacing w:val="-12"/>
+                <w:sz w:val="24"/>
+                <w:szCs w:val="24"/>
+              </w:rPr>
+              <w:t>지침」을</w:t>
+            </w:r>
+            <w:proofErr w:type="spellEnd"/>
+            <w:r>
+              <w:rPr>
+                <w:rFonts w:ascii="굴림" w:eastAsia="굴림" w:cs="굴림"/>
+                <w:b/>
+                <w:bCs/>
+                <w:spacing w:val="-12"/>
+                <w:sz w:val="24"/>
+                <w:szCs w:val="24"/>
+              </w:rPr>
+              <w:t xml:space="preserve"> 준</w:t>
             </w:r>
             <w:r>
               <w:rPr>
@@ -7609,7 +7731,6 @@
         </w:rPr>
         <w:t xml:space="preserve">2026.  </w:t>
       </w:r>
-      <w:proofErr w:type="gramStart"/>
       <w:r>
         <w:rPr>
           <w:rFonts w:ascii="HCI Poppy" w:eastAsiaTheme="minorEastAsia" w:cs="HCI Poppy" w:hint="eastAsia"/>
@@ -7624,43 +7745,32 @@
           <w:sz w:val="28"/>
           <w:szCs w:val="28"/>
         </w:rPr>
-        <w:t xml:space="preserve"> .</w:t>
+        <w:t xml:space="preserve"> .  </w:t>
       </w:r>
-      <w:proofErr w:type="gramEnd"/>
+      <w:r>
+        <w:rPr>
+          <w:rFonts w:ascii="HCI Poppy" w:eastAsiaTheme="minorEastAsia" w:cs="HCI Poppy" w:hint="eastAsia"/>
+          <w:sz w:val="28"/>
+          <w:szCs w:val="28"/>
+        </w:rPr>
+        <w:t>1</w:t>
+      </w:r>
+      <w:r>
+        <w:rPr>
+          <w:rFonts w:ascii="HCI Poppy" w:eastAsiaTheme="minorEastAsia" w:cs="HCI Poppy" w:hint="eastAsia"/>
+          <w:sz w:val="28"/>
+          <w:szCs w:val="28"/>
+        </w:rPr>
+        <w:t>1</w:t>
+      </w:r>
       <w:r>
         <w:rPr>
           <w:rFonts w:ascii="HCI Poppy" w:eastAsia="HCI Poppy" w:cs="HCI Poppy"/>
           <w:sz w:val="28"/>
           <w:szCs w:val="28"/>
         </w:rPr>
-        <w:t xml:space="preserve">  </w:t>
-      </w:r>
-      <w:proofErr w:type="gramStart"/>
-      <w:r>
-        <w:rPr>
-          <w:rFonts w:ascii="HCI Poppy" w:eastAsiaTheme="minorEastAsia" w:cs="HCI Poppy" w:hint="eastAsia"/>
-          <w:sz w:val="28"/>
-          <w:szCs w:val="28"/>
-        </w:rPr>
-        <w:t>1</w:t>
-      </w:r>
-      <w:r>
-        <w:rPr>
-          <w:rFonts w:ascii="HCI Poppy" w:eastAsiaTheme="minorEastAsia" w:cs="HCI Poppy" w:hint="eastAsia"/>
-          <w:sz w:val="28"/>
-          <w:szCs w:val="28"/>
-        </w:rPr>
-        <w:t>1</w:t>
-      </w:r>
-      <w:r>
-        <w:rPr>
-          <w:rFonts w:ascii="HCI Poppy" w:eastAsia="HCI Poppy" w:cs="HCI Poppy"/>
-          <w:sz w:val="28"/>
-          <w:szCs w:val="28"/>
-        </w:rPr>
         <w:t xml:space="preserve"> .</w:t>
       </w:r>
-      <w:proofErr w:type="gramEnd"/>
     </w:p>
     <w:tbl>
       <w:tblPr>
@@ -7758,7 +7868,6 @@
                 <w:szCs w:val="24"/>
               </w:rPr>
             </w:pPr>
-            <w:proofErr w:type="gramStart"/>
             <w:r>
               <w:rPr>
                 <w:rFonts w:ascii="굴림" w:eastAsia="굴림" w:cs="굴림"/>
@@ -7769,7 +7878,6 @@
               </w:rPr>
               <w:t>소  속</w:t>
             </w:r>
-            <w:proofErr w:type="gramEnd"/>
           </w:p>
         </w:tc>
         <w:tc>
@@ -7838,7 +7946,6 @@
                 <w:szCs w:val="24"/>
               </w:rPr>
             </w:pPr>
-            <w:proofErr w:type="gramStart"/>
             <w:r>
               <w:rPr>
                 <w:rFonts w:ascii="굴림" w:eastAsia="굴림" w:cs="굴림"/>
@@ -7847,18 +7954,7 @@
                 <w:sz w:val="24"/>
                 <w:szCs w:val="24"/>
               </w:rPr>
-              <w:t>서  명</w:t>
-            </w:r>
-            <w:proofErr w:type="gramEnd"/>
-            <w:r>
-              <w:rPr>
-                <w:rFonts w:ascii="굴림" w:eastAsia="굴림" w:cs="굴림"/>
-                <w:b/>
-                <w:bCs/>
-                <w:sz w:val="24"/>
-                <w:szCs w:val="24"/>
-              </w:rPr>
-              <w:t xml:space="preserve"> </w:t>
+              <w:t xml:space="preserve">서  명 </w:t>
             </w:r>
           </w:p>
         </w:tc>
@@ -8021,12 +8117,14 @@
               <w:wordWrap/>
               <w:jc w:val="center"/>
             </w:pPr>
+            <w:proofErr w:type="spellStart"/>
             <w:r>
               <w:rPr>
                 <w:rFonts w:hint="eastAsia"/>
               </w:rPr>
               <w:t>유창재</w:t>
             </w:r>
+            <w:proofErr w:type="spellEnd"/>
           </w:p>
         </w:tc>
         <w:tc>
@@ -8329,33 +8427,6 @@
                 <w:szCs w:val="22"/>
               </w:rPr>
             </w:pPr>
-            <w:r>
-              <w:rPr>
-                <w:rFonts w:ascii="HCI Poppy" w:eastAsia="HY신명조" w:cs="HY신명조"/>
-                <w:spacing w:val="-1"/>
-                <w:sz w:val="22"/>
-                <w:szCs w:val="22"/>
-              </w:rPr>
-              <w:t>□</w:t>
-            </w:r>
-            <w:r>
-              <w:rPr>
-                <w:rFonts w:ascii="HCI Poppy" w:eastAsia="HY신명조" w:cs="HY신명조"/>
-                <w:spacing w:val="-1"/>
-                <w:sz w:val="22"/>
-                <w:szCs w:val="22"/>
-              </w:rPr>
-              <w:t xml:space="preserve"> </w:t>
-            </w:r>
-            <w:r>
-              <w:rPr>
-                <w:rFonts w:ascii="HCI Poppy" w:eastAsia="휴먼명조" w:cs="휴먼명조"/>
-                <w:spacing w:val="-1"/>
-                <w:sz w:val="22"/>
-                <w:szCs w:val="22"/>
-              </w:rPr>
-              <w:t>동의</w:t>
-            </w:r>
           </w:p>
         </w:tc>
         <w:tc>
@@ -8383,33 +8454,6 @@
                 <w:szCs w:val="22"/>
               </w:rPr>
             </w:pPr>
-            <w:r>
-              <w:rPr>
-                <w:rFonts w:ascii="HCI Poppy" w:eastAsia="HY신명조" w:cs="HY신명조"/>
-                <w:spacing w:val="-1"/>
-                <w:sz w:val="22"/>
-                <w:szCs w:val="22"/>
-              </w:rPr>
-              <w:t>□</w:t>
-            </w:r>
-            <w:r>
-              <w:rPr>
-                <w:rFonts w:ascii="HCI Poppy" w:eastAsia="HY신명조" w:cs="HY신명조"/>
-                <w:spacing w:val="-1"/>
-                <w:sz w:val="22"/>
-                <w:szCs w:val="22"/>
-              </w:rPr>
-              <w:t xml:space="preserve"> </w:t>
-            </w:r>
-            <w:r>
-              <w:rPr>
-                <w:rFonts w:ascii="HCI Poppy" w:eastAsia="휴먼명조" w:cs="휴먼명조"/>
-                <w:spacing w:val="-1"/>
-                <w:sz w:val="22"/>
-                <w:szCs w:val="22"/>
-              </w:rPr>
-              <w:t>미동의</w:t>
-            </w:r>
           </w:p>
         </w:tc>
         <w:tc>
@@ -8505,33 +8549,6 @@
                 <w:szCs w:val="22"/>
               </w:rPr>
             </w:pPr>
-            <w:r>
-              <w:rPr>
-                <w:rFonts w:ascii="HCI Poppy" w:eastAsia="HY신명조" w:cs="HY신명조"/>
-                <w:spacing w:val="-1"/>
-                <w:sz w:val="22"/>
-                <w:szCs w:val="22"/>
-              </w:rPr>
-              <w:t>□</w:t>
-            </w:r>
-            <w:r>
-              <w:rPr>
-                <w:rFonts w:ascii="HCI Poppy" w:eastAsia="HY신명조" w:cs="HY신명조"/>
-                <w:spacing w:val="-1"/>
-                <w:sz w:val="22"/>
-                <w:szCs w:val="22"/>
-              </w:rPr>
-              <w:t xml:space="preserve"> </w:t>
-            </w:r>
-            <w:r>
-              <w:rPr>
-                <w:rFonts w:ascii="HCI Poppy" w:eastAsia="휴먼명조" w:cs="휴먼명조"/>
-                <w:spacing w:val="-1"/>
-                <w:sz w:val="22"/>
-                <w:szCs w:val="22"/>
-              </w:rPr>
-              <w:t>동의</w:t>
-            </w:r>
           </w:p>
         </w:tc>
         <w:tc>
@@ -8559,33 +8576,6 @@
                 <w:szCs w:val="22"/>
               </w:rPr>
             </w:pPr>
-            <w:r>
-              <w:rPr>
-                <w:rFonts w:ascii="HCI Poppy" w:eastAsia="HY신명조" w:cs="HY신명조"/>
-                <w:spacing w:val="-1"/>
-                <w:sz w:val="22"/>
-                <w:szCs w:val="22"/>
-              </w:rPr>
-              <w:t>□</w:t>
-            </w:r>
-            <w:r>
-              <w:rPr>
-                <w:rFonts w:ascii="HCI Poppy" w:eastAsia="HY신명조" w:cs="HY신명조"/>
-                <w:spacing w:val="-1"/>
-                <w:sz w:val="22"/>
-                <w:szCs w:val="22"/>
-              </w:rPr>
-              <w:t xml:space="preserve"> </w:t>
-            </w:r>
-            <w:r>
-              <w:rPr>
-                <w:rFonts w:ascii="HCI Poppy" w:eastAsia="휴먼명조" w:cs="휴먼명조"/>
-                <w:spacing w:val="-1"/>
-                <w:sz w:val="22"/>
-                <w:szCs w:val="22"/>
-              </w:rPr>
-              <w:t>미동의</w:t>
-            </w:r>
           </w:p>
         </w:tc>
         <w:tc>
@@ -8681,33 +8671,6 @@
                 <w:szCs w:val="22"/>
               </w:rPr>
             </w:pPr>
-            <w:r>
-              <w:rPr>
-                <w:rFonts w:ascii="HCI Poppy" w:eastAsia="HY신명조" w:cs="HY신명조"/>
-                <w:spacing w:val="-1"/>
-                <w:sz w:val="22"/>
-                <w:szCs w:val="22"/>
-              </w:rPr>
-              <w:t>□</w:t>
-            </w:r>
-            <w:r>
-              <w:rPr>
-                <w:rFonts w:ascii="HCI Poppy" w:eastAsia="HY신명조" w:cs="HY신명조"/>
-                <w:spacing w:val="-1"/>
-                <w:sz w:val="22"/>
-                <w:szCs w:val="22"/>
-              </w:rPr>
-              <w:t xml:space="preserve"> </w:t>
-            </w:r>
-            <w:r>
-              <w:rPr>
-                <w:rFonts w:ascii="HCI Poppy" w:eastAsia="휴먼명조" w:cs="휴먼명조"/>
-                <w:spacing w:val="-1"/>
-                <w:sz w:val="22"/>
-                <w:szCs w:val="22"/>
-              </w:rPr>
-              <w:t>동의</w:t>
-            </w:r>
           </w:p>
         </w:tc>
         <w:tc>
@@ -8735,33 +8698,6 @@
                 <w:szCs w:val="22"/>
               </w:rPr>
             </w:pPr>
-            <w:r>
-              <w:rPr>
-                <w:rFonts w:ascii="HCI Poppy" w:eastAsia="HY신명조" w:cs="HY신명조"/>
-                <w:spacing w:val="-1"/>
-                <w:sz w:val="22"/>
-                <w:szCs w:val="22"/>
-              </w:rPr>
-              <w:t>□</w:t>
-            </w:r>
-            <w:r>
-              <w:rPr>
-                <w:rFonts w:ascii="HCI Poppy" w:eastAsia="HY신명조" w:cs="HY신명조"/>
-                <w:spacing w:val="-1"/>
-                <w:sz w:val="22"/>
-                <w:szCs w:val="22"/>
-              </w:rPr>
-              <w:t xml:space="preserve"> </w:t>
-            </w:r>
-            <w:r>
-              <w:rPr>
-                <w:rFonts w:ascii="HCI Poppy" w:eastAsia="휴먼명조" w:cs="휴먼명조"/>
-                <w:spacing w:val="-1"/>
-                <w:sz w:val="22"/>
-                <w:szCs w:val="22"/>
-              </w:rPr>
-              <w:t>미동의</w:t>
-            </w:r>
           </w:p>
         </w:tc>
         <w:tc>
@@ -8857,33 +8793,6 @@
                 <w:szCs w:val="22"/>
               </w:rPr>
             </w:pPr>
-            <w:r>
-              <w:rPr>
-                <w:rFonts w:ascii="HCI Poppy" w:eastAsia="HY신명조" w:cs="HY신명조"/>
-                <w:spacing w:val="-1"/>
-                <w:sz w:val="22"/>
-                <w:szCs w:val="22"/>
-              </w:rPr>
-              <w:t>□</w:t>
-            </w:r>
-            <w:r>
-              <w:rPr>
-                <w:rFonts w:ascii="HCI Poppy" w:eastAsia="HY신명조" w:cs="HY신명조"/>
-                <w:spacing w:val="-1"/>
-                <w:sz w:val="22"/>
-                <w:szCs w:val="22"/>
-              </w:rPr>
-              <w:t xml:space="preserve"> </w:t>
-            </w:r>
-            <w:r>
-              <w:rPr>
-                <w:rFonts w:ascii="HCI Poppy" w:eastAsia="휴먼명조" w:cs="휴먼명조"/>
-                <w:spacing w:val="-1"/>
-                <w:sz w:val="22"/>
-                <w:szCs w:val="22"/>
-              </w:rPr>
-              <w:t>동의</w:t>
-            </w:r>
           </w:p>
         </w:tc>
         <w:tc>
@@ -8911,33 +8820,6 @@
                 <w:szCs w:val="22"/>
               </w:rPr>
             </w:pPr>
-            <w:r>
-              <w:rPr>
-                <w:rFonts w:ascii="HCI Poppy" w:eastAsia="HY신명조" w:cs="HY신명조"/>
-                <w:spacing w:val="-1"/>
-                <w:sz w:val="22"/>
-                <w:szCs w:val="22"/>
-              </w:rPr>
-              <w:t>□</w:t>
-            </w:r>
-            <w:r>
-              <w:rPr>
-                <w:rFonts w:ascii="HCI Poppy" w:eastAsia="HY신명조" w:cs="HY신명조"/>
-                <w:spacing w:val="-1"/>
-                <w:sz w:val="22"/>
-                <w:szCs w:val="22"/>
-              </w:rPr>
-              <w:t xml:space="preserve"> </w:t>
-            </w:r>
-            <w:r>
-              <w:rPr>
-                <w:rFonts w:ascii="HCI Poppy" w:eastAsia="휴먼명조" w:cs="휴먼명조"/>
-                <w:spacing w:val="-1"/>
-                <w:sz w:val="22"/>
-                <w:szCs w:val="22"/>
-              </w:rPr>
-              <w:t>미동의</w:t>
-            </w:r>
           </w:p>
         </w:tc>
         <w:tc>
@@ -9844,7 +9726,6 @@
     <w:basedOn w:val="a"/>
     <w:link w:val="Char"/>
     <w:uiPriority w:val="99"/>
-    <w:semiHidden/>
     <w:unhideWhenUsed/>
     <w:pPr>
       <w:tabs>
@@ -9859,14 +9740,12 @@
     <w:basedOn w:val="a0"/>
     <w:link w:val="a3"/>
     <w:uiPriority w:val="99"/>
-    <w:semiHidden/>
   </w:style>
   <w:style w:type="paragraph" w:styleId="a4">
     <w:name w:val="footer"/>
     <w:basedOn w:val="a"/>
     <w:link w:val="Char0"/>
     <w:uiPriority w:val="99"/>
-    <w:semiHidden/>
     <w:unhideWhenUsed/>
     <w:pPr>
       <w:tabs>
@@ -9881,7 +9760,6 @@
     <w:basedOn w:val="a0"/>
     <w:link w:val="a4"/>
     <w:uiPriority w:val="99"/>
-    <w:semiHidden/>
   </w:style>
   <w:style w:type="character" w:styleId="a5">
     <w:name w:val="Hyperlink"/>
@@ -11275,7 +11153,7 @@
     </inkml:brush>
   </inkml:definitions>
   <inkml:trace contextRef="#ctx0" brushRef="#br0">1 48 24575,'11'1'0,"-1"0"0,1 1 0,0 0 0,-1 1 0,1 1 0,11 4 0,26 8 0,31-1 0,-56-13 0,-1 2 0,0 1 0,0 0 0,28 12 0,-47-15 0,0-1 0,0 1 0,1 0 0,-1 0 0,0 0 0,-1 0 0,1 0 0,0 0 0,-1 1 0,1-1 0,-1 1 0,0 0 0,0 0 0,0 0 0,0 0 0,0 0 0,-1 0 0,1 1 0,-1-1 0,0 1 0,0-1 0,0 0 0,0 1 0,-1 0 0,0-1 0,1 1 0,-1-1 0,0 1 0,-1-1 0,0 8 0,-1-3 0,-1 0 0,1 0 0,-1 0 0,-1-1 0,1 1 0,-1-1 0,-1 0 0,1 0 0,-1 0 0,-1 0 0,1-1 0,-8 6 0,-19 15-273,-1-2 0,-1-2 0,-2-1 0,-65 30 0,74-39-6553</inkml:trace>
-  <inkml:trace contextRef="#ctx0" brushRef="#br0" timeOffset="296.71">355 425 24575,'4'0'0,"17"8"0,22 3 0,14 11 0,3 2 0,-6-3 0,-12-5-8191</inkml:trace>
+  <inkml:trace contextRef="#ctx0" brushRef="#br0" timeOffset="296.7">355 425 24575,'4'0'0,"17"8"0,22 3 0,14 11 0,3 2 0,-6-3 0,-12-5-8191</inkml:trace>
   <inkml:trace contextRef="#ctx0" brushRef="#br0" timeOffset="580.77">684 283 24575,'0'-3'0,"0"-3"-8191</inkml:trace>
   <inkml:trace contextRef="#ctx0" brushRef="#br0" timeOffset="937.03">684 260 24575,'0'8'0,"0"11"0,0 14 0,0 5 0,0 0 0,0 2 0,0 3 0,0 0 0,0-1 0,-4-9 0,-1-10-8191</inkml:trace>
   <inkml:trace contextRef="#ctx0" brushRef="#br0" timeOffset="1269.54">637 424 24575,'0'-4'0,"0"-6"0,0-4 0,4 0 0,6-2 0,0-2 0,3-3 0,-1 4-8191</inkml:trace>

</xml_diff>